<commit_message>
feat: update responsive design for HowItWorks component
</commit_message>
<xml_diff>
--- a/TWC Observations.docx
+++ b/TWC Observations.docx
@@ -257,6 +257,9 @@
     </w:p>
     <w:p>
       <w:r>
+        <w:rPr>
+          <w:noProof/>
+        </w:rPr>
         <w:drawing>
           <wp:inline distT="0" distB="0" distL="0" distR="0" wp14:anchorId="704A7E8F" wp14:editId="0C36CB2C">
             <wp:extent cx="5943600" cy="919480"/>
@@ -311,46 +314,86 @@
       </w:r>
     </w:p>
     <w:p>
+      <w:pPr>
+        <w:spacing w:after="0" w:line="240" w:lineRule="auto"/>
+      </w:pPr>
       <w:r>
         <w:t>OBJECTIVE:</w:t>
       </w:r>
     </w:p>
     <w:p>
+      <w:pPr>
+        <w:spacing w:after="0" w:line="240" w:lineRule="auto"/>
+      </w:pPr>
       <w:r>
         <w:lastRenderedPageBreak/>
         <w:t xml:space="preserve">Generate a luxurious, high-resolution product image optimized for a bakery website hero banner (2.09 aspect ratio). This image is part of a 5-image carousel, so visual consistency across all outputs is critical. Keep all original label details sharp and readable. </w:t>
       </w:r>
     </w:p>
-    <w:p/>
-    <w:p>
+    <w:p>
+      <w:pPr>
+        <w:spacing w:after="0" w:line="240" w:lineRule="auto"/>
+      </w:pPr>
+    </w:p>
+    <w:p>
+      <w:pPr>
+        <w:spacing w:after="0" w:line="240" w:lineRule="auto"/>
+      </w:pPr>
       <w:r>
         <w:t>COMPOSITION &amp; FRAMING:</w:t>
       </w:r>
     </w:p>
-    <w:p/>
-    <w:p>
+    <w:p>
+      <w:pPr>
+        <w:spacing w:after="0" w:line="240" w:lineRule="auto"/>
+      </w:pPr>
+    </w:p>
+    <w:p>
+      <w:pPr>
+        <w:spacing w:after="0" w:line="240" w:lineRule="auto"/>
+      </w:pPr>
       <w:r>
         <w:t>Final aspect ratio: 2.09 (banner format)</w:t>
       </w:r>
     </w:p>
     <w:p>
+      <w:pPr>
+        <w:spacing w:after="0" w:line="240" w:lineRule="auto"/>
+      </w:pPr>
       <w:r>
         <w:t>Position the cake on the right third of the frame, leaving generous negative space on the left for text overlay</w:t>
       </w:r>
     </w:p>
     <w:p>
+      <w:pPr>
+        <w:spacing w:after="0" w:line="240" w:lineRule="auto"/>
+      </w:pPr>
       <w:r>
         <w:t>Maintain the same camera angle, distance, and perspective across all 5 cake variations.</w:t>
       </w:r>
     </w:p>
-    <w:p/>
-    <w:p>
+    <w:p>
+      <w:pPr>
+        <w:spacing w:after="0" w:line="240" w:lineRule="auto"/>
+      </w:pPr>
+    </w:p>
+    <w:p>
+      <w:pPr>
+        <w:spacing w:after="0" w:line="240" w:lineRule="auto"/>
+      </w:pPr>
       <w:r>
         <w:t>CAKE PRESENTATION:</w:t>
       </w:r>
     </w:p>
-    <w:p/>
-    <w:p>
+    <w:p>
+      <w:pPr>
+        <w:spacing w:after="0" w:line="240" w:lineRule="auto"/>
+      </w:pPr>
+    </w:p>
+    <w:p>
+      <w:pPr>
+        <w:spacing w:after="0" w:line="240" w:lineRule="auto"/>
+      </w:pPr>
       <w:r>
         <w:t xml:space="preserve">Place cake on top an elegant white marble </w:t>
       </w:r>
@@ -364,6 +407,9 @@
       </w:r>
     </w:p>
     <w:p>
+      <w:pPr>
+        <w:spacing w:after="0" w:line="240" w:lineRule="auto"/>
+      </w:pPr>
       <w:r>
         <w:t xml:space="preserve">Position the stand on a wide, smooth pearl white table which should be wide enough to cover the entire photo frame. Only </w:t>
       </w:r>
@@ -377,55 +423,101 @@
       </w:r>
     </w:p>
     <w:p>
+      <w:pPr>
+        <w:spacing w:after="0" w:line="240" w:lineRule="auto"/>
+      </w:pPr>
       <w:r>
         <w:t>Preserve all original label details - keep text sharp, crisp, and fully readable</w:t>
       </w:r>
     </w:p>
     <w:p>
+      <w:pPr>
+        <w:spacing w:after="0" w:line="240" w:lineRule="auto"/>
+      </w:pPr>
       <w:r>
         <w:t>Enhance resolution for professional sharpness without losing detail</w:t>
       </w:r>
     </w:p>
-    <w:p/>
-    <w:p>
+    <w:p>
+      <w:pPr>
+        <w:spacing w:after="0" w:line="240" w:lineRule="auto"/>
+      </w:pPr>
+    </w:p>
+    <w:p>
+      <w:pPr>
+        <w:spacing w:after="0" w:line="240" w:lineRule="auto"/>
+      </w:pPr>
       <w:r>
         <w:t>STYLING &amp; PROPS:</w:t>
       </w:r>
     </w:p>
-    <w:p/>
-    <w:p>
+    <w:p>
+      <w:pPr>
+        <w:spacing w:after="0" w:line="240" w:lineRule="auto"/>
+      </w:pPr>
+    </w:p>
+    <w:p>
+      <w:pPr>
+        <w:spacing w:after="0" w:line="240" w:lineRule="auto"/>
+      </w:pPr>
       <w:r>
         <w:t>Scatter delicate flowers (roses, peonies, or similar luxury florals) on a soft linen or silk blanket draped naturally across the entire table</w:t>
       </w:r>
     </w:p>
     <w:p>
+      <w:pPr>
+        <w:spacing w:after="0" w:line="240" w:lineRule="auto"/>
+      </w:pPr>
       <w:r>
         <w:t>Flowers should frame the cake subtly - use good number of flowers but avoid overcrowding.</w:t>
       </w:r>
     </w:p>
     <w:p>
+      <w:pPr>
+        <w:spacing w:after="0" w:line="240" w:lineRule="auto"/>
+      </w:pPr>
       <w:r>
         <w:t>Use the same floral arrangement style and placement pattern for all 5 images to maintain carousel consistency</w:t>
       </w:r>
     </w:p>
     <w:p>
+      <w:pPr>
+        <w:spacing w:after="0" w:line="240" w:lineRule="auto"/>
+      </w:pPr>
       <w:r>
         <w:t>Props should feel organic, not staged - mimic editorial bakery photography</w:t>
       </w:r>
     </w:p>
-    <w:p/>
-    <w:p>
+    <w:p>
+      <w:pPr>
+        <w:spacing w:after="0" w:line="240" w:lineRule="auto"/>
+      </w:pPr>
+    </w:p>
+    <w:p>
+      <w:pPr>
+        <w:spacing w:after="0" w:line="240" w:lineRule="auto"/>
+      </w:pPr>
       <w:r>
         <w:t>BACKGROUND DESIGN:</w:t>
       </w:r>
     </w:p>
-    <w:p/>
-    <w:p>
+    <w:p>
+      <w:pPr>
+        <w:spacing w:after="0" w:line="240" w:lineRule="auto"/>
+      </w:pPr>
+    </w:p>
+    <w:p>
+      <w:pPr>
+        <w:spacing w:after="0" w:line="240" w:lineRule="auto"/>
+      </w:pPr>
       <w:r>
         <w:t>Modern, simple, geometric boxy/paneled wall design</w:t>
       </w:r>
     </w:p>
     <w:p>
+      <w:pPr>
+        <w:spacing w:after="0" w:line="240" w:lineRule="auto"/>
+      </w:pPr>
       <w:r>
         <w:t xml:space="preserve">Color palette: Soft blush </w:t>
       </w:r>
@@ -439,93 +531,162 @@
       </w:r>
     </w:p>
     <w:p>
+      <w:pPr>
+        <w:spacing w:after="0" w:line="240" w:lineRule="auto"/>
+      </w:pPr>
       <w:r>
         <w:t>Background pattern must be perfectly symmetrical and consistent across all 5 carousel images</w:t>
       </w:r>
     </w:p>
     <w:p>
+      <w:pPr>
+        <w:spacing w:after="0" w:line="240" w:lineRule="auto"/>
+      </w:pPr>
       <w:r>
         <w:t>Maintain the same lighting setup and wall design for visual cohesion</w:t>
       </w:r>
     </w:p>
-    <w:p/>
-    <w:p>
+    <w:p>
+      <w:pPr>
+        <w:spacing w:after="0" w:line="240" w:lineRule="auto"/>
+      </w:pPr>
+    </w:p>
+    <w:p>
+      <w:pPr>
+        <w:spacing w:after="0" w:line="240" w:lineRule="auto"/>
+      </w:pPr>
       <w:r>
         <w:t>LIGHTING &amp; ATMOSPHERE:</w:t>
       </w:r>
     </w:p>
-    <w:p/>
-    <w:p>
+    <w:p>
+      <w:pPr>
+        <w:spacing w:after="0" w:line="240" w:lineRule="auto"/>
+      </w:pPr>
+    </w:p>
+    <w:p>
+      <w:pPr>
+        <w:spacing w:after="0" w:line="240" w:lineRule="auto"/>
+      </w:pPr>
       <w:r>
         <w:t>Soft, diffused natural bright lighting from the left side (to match right-positioned cake)</w:t>
       </w:r>
     </w:p>
     <w:p>
+      <w:pPr>
+        <w:spacing w:after="0" w:line="240" w:lineRule="auto"/>
+      </w:pPr>
       <w:r>
         <w:t>Gentle shadows that add depth without being harsh</w:t>
       </w:r>
     </w:p>
     <w:p>
+      <w:pPr>
+        <w:spacing w:after="0" w:line="240" w:lineRule="auto"/>
+      </w:pPr>
       <w:r>
         <w:t>Match the original photo's lighting quality - warm, inviting, professional</w:t>
       </w:r>
     </w:p>
     <w:p>
+      <w:pPr>
+        <w:spacing w:after="0" w:line="240" w:lineRule="auto"/>
+      </w:pPr>
       <w:r>
         <w:t>Consistent color temperature across all images (slightly warm, around 5500K)</w:t>
       </w:r>
     </w:p>
-    <w:p/>
-    <w:p>
-      <w:r>
+    <w:p>
+      <w:pPr>
+        <w:spacing w:after="0" w:line="240" w:lineRule="auto"/>
+      </w:pPr>
+    </w:p>
+    <w:p>
+      <w:pPr>
+        <w:spacing w:after="0" w:line="240" w:lineRule="auto"/>
+      </w:pPr>
+      <w:r>
+        <w:lastRenderedPageBreak/>
         <w:t>TECHNICAL REQUIREMENTS:</w:t>
       </w:r>
     </w:p>
-    <w:p/>
-    <w:p>
+    <w:p>
+      <w:pPr>
+        <w:spacing w:after="0" w:line="240" w:lineRule="auto"/>
+      </w:pPr>
+    </w:p>
+    <w:p>
+      <w:pPr>
+        <w:spacing w:after="0" w:line="240" w:lineRule="auto"/>
+      </w:pPr>
       <w:r>
         <w:t>Use generative fill to seamlessly expand canvas to 23:9 while maintaining photographic realism</w:t>
       </w:r>
     </w:p>
     <w:p>
+      <w:pPr>
+        <w:spacing w:after="0" w:line="240" w:lineRule="auto"/>
+      </w:pPr>
       <w:r>
         <w:t>Blend expanded areas perfectly with original image lighting, shadows, texture, and depth of field</w:t>
       </w:r>
     </w:p>
     <w:p>
+      <w:pPr>
+        <w:spacing w:after="0" w:line="240" w:lineRule="auto"/>
+      </w:pPr>
       <w:r>
         <w:t>Upscale to high resolution (minimum 3840x1500px) for crisp web display</w:t>
       </w:r>
     </w:p>
     <w:p>
+      <w:pPr>
+        <w:spacing w:after="0" w:line="240" w:lineRule="auto"/>
+      </w:pPr>
       <w:r>
         <w:t>Ensure consistency in grain, sharpness, and post-processing style across all 5 variations</w:t>
       </w:r>
     </w:p>
-    <w:p/>
-    <w:p>
+    <w:p>
+      <w:pPr>
+        <w:spacing w:after="0" w:line="240" w:lineRule="auto"/>
+      </w:pPr>
+    </w:p>
+    <w:p>
+      <w:pPr>
+        <w:spacing w:after="0" w:line="240" w:lineRule="auto"/>
+      </w:pPr>
       <w:r>
         <w:t>BRAND AESTHETIC:</w:t>
       </w:r>
     </w:p>
-    <w:p/>
-    <w:p>
-      <w:r>
-        <w:lastRenderedPageBreak/>
+    <w:p>
+      <w:pPr>
+        <w:spacing w:after="0" w:line="240" w:lineRule="auto"/>
+      </w:pPr>
+    </w:p>
+    <w:p>
+      <w:pPr>
+        <w:spacing w:after="0" w:line="240" w:lineRule="auto"/>
+      </w:pPr>
+      <w:r>
         <w:t>Elegant, luxurious, modern minimalist</w:t>
       </w:r>
     </w:p>
     <w:p>
+      <w:pPr>
+        <w:spacing w:after="0" w:line="240" w:lineRule="auto"/>
+      </w:pPr>
       <w:r>
         <w:t>Think high-end bakery brands: clean, sophisticated, Instagram-worthy</w:t>
       </w:r>
     </w:p>
     <w:p>
-      <w:r>
-        <w:t>Evoke feelings of celebration, indulgence, and quality craftsmanship</w:t>
-      </w:r>
-      <w:r>
-        <w:t xml:space="preserve"> </w:t>
+      <w:pPr>
+        <w:spacing w:after="0" w:line="240" w:lineRule="auto"/>
+      </w:pPr>
+      <w:r>
+        <w:t xml:space="preserve">Evoke feelings of celebration, indulgence, and quality craftsmanship </w:t>
       </w:r>
     </w:p>
     <w:p/>

</xml_diff>